<commit_message>
Remove the Practice Exam slide — no Six Sigma practice exam exists (v3)
exams.tertiaryinfotech.com has no Six Sigma practice exam, so the slide and its
bundled clssgb-practice-exam.png asset have been removed rather than pointing
learners at something that does not exist. A comment in build_slides.py records
why, so the slide is not reintroduced for this course.

Deck 497 -> 496 slides. Version bumped to v3 across the PPT cover/filename, and
a v3 row added to the Document Version Control Record in both the Lesson Plan
and the Learner Guide. Superseded v2 artifacts moved to courseware/archive/.

Co-Authored-By: Claude Opus 4.8 (1M context) <noreply@anthropic.com>
</commit_message>
<xml_diff>
--- a/courseware/LG-Certified Lean Six Sigma Green Belt (CLSSGB) Training.docx
+++ b/courseware/LG-Certified Lean Six Sigma Green Belt (CLSSGB) Training.docx
@@ -179,7 +179,7 @@
           <w:color w:val="1F6FEB"/>
           <w:sz w:val="24"/>
         </w:rPr>
-        <w:t>Version 2</w:t>
+        <w:t>Version 3</w:t>
       </w:r>
     </w:p>
     <w:p>
@@ -381,6 +381,64 @@
                 <w:sz w:val="19"/>
               </w:rPr>
               <w:t>Major revision: rebuilt as a 4-day Green Belt progression from the Yellow Belt (CLSSYB, TGS-2025053922). Content deepened to the CSSC Green Belt scope (Chapters 1-24) - adds sampling and sample size calculation, Measurement System Analysis and Gage R&amp;R, hypothesis testing with p-values and Type I/II errors, correlation and regression, FMEA and RPN, Design of Experiments, SPC control chart selection with the eight out-of-control rules, and process capability Cp/Cpk. Expanded from 10 to 25 hands-on labs across the five DMAIC phases; the running scenario is now the Northwind Retail Distribution Centre order-fulfilment process, matching the WA (SAQ) and PP assessment papers.</w:t>
+            </w:r>
+          </w:p>
+        </w:tc>
+        <w:tc>
+          <w:tcPr>
+            <w:tcW w:type="dxa" w:w="2160"/>
+          </w:tcPr>
+          <w:p>
+            <w:r/>
+            <w:r>
+              <w:rPr>
+                <w:sz w:val="19"/>
+              </w:rPr>
+              <w:t>Dr. Alfred Ang</w:t>
+            </w:r>
+          </w:p>
+        </w:tc>
+      </w:tr>
+      <w:tr>
+        <w:tc>
+          <w:tcPr>
+            <w:tcW w:type="dxa" w:w="2160"/>
+          </w:tcPr>
+          <w:p>
+            <w:r/>
+            <w:r>
+              <w:rPr>
+                <w:sz w:val="19"/>
+              </w:rPr>
+              <w:t>3</w:t>
+            </w:r>
+          </w:p>
+        </w:tc>
+        <w:tc>
+          <w:tcPr>
+            <w:tcW w:type="dxa" w:w="2160"/>
+          </w:tcPr>
+          <w:p>
+            <w:r/>
+            <w:r>
+              <w:rPr>
+                <w:sz w:val="19"/>
+              </w:rPr>
+              <w:t>19 July 2026</w:t>
+            </w:r>
+          </w:p>
+        </w:tc>
+        <w:tc>
+          <w:tcPr>
+            <w:tcW w:type="dxa" w:w="2160"/>
+          </w:tcPr>
+          <w:p>
+            <w:r/>
+            <w:r>
+              <w:rPr>
+                <w:sz w:val="19"/>
+              </w:rPr>
+              <w:t>Removed the Practice Exam slide and its asset - there is no Six Sigma practice exam on exams.tertiaryinfotech.com.</w:t>
             </w:r>
           </w:p>
         </w:tc>

</xml_diff>